<commit_message>
Refine space measurement layout in summaries
</commit_message>
<xml_diff>
--- a/revize-frontend/dist/templates/elektro_rz_template_compact_conditional_images_boxed.docx
+++ b/revize-frontend/dist/templates/elektro_rz_template_compact_conditional_images_boxed.docx
@@ -3382,343 +3382,295 @@
     <w:tbl>
       <w:tblPr>
         <w:tblW w:w="0" w:type="auto"/>
-        <w:tblBorders>
-          <w:top w:val="nil"/>
-          <w:left w:val="nil"/>
-          <w:bottom w:val="nil"/>
-          <w:right w:val="nil"/>
-          <w:insideH w:val="nil"/>
-          <w:insideV w:val="nil"/>
-        </w:tblBorders>
+        <w:jc w:val="center"/>
+        <w:tblLayout w:type="fixed"/>
         <w:tblLook w:val="04A0" w:firstRow="1" w:lastRow="0" w:firstColumn="1" w:lastColumn="0" w:noHBand="0" w:noVBand="1"/>
       </w:tblPr>
       <w:tblGrid>
-        <w:gridCol w:w="1723"/>
-        <w:gridCol w:w="1479"/>
-        <w:gridCol w:w="1541"/>
-        <w:gridCol w:w="1435"/>
-        <w:gridCol w:w="1532"/>
-        <w:gridCol w:w="2590"/>
+        <w:gridCol w:w="4082"/>
+        <w:gridCol w:w="2268"/>
+        <w:gridCol w:w="2835"/>
+        <w:gridCol w:w="1701"/>
       </w:tblGrid>
       <w:tr>
         <w:trPr>
-          <w:trHeight w:hRule="exact" w:val="284"/>
+          <w:jc w:val="center"/>
         </w:trPr>
         <w:tc>
           <w:tcPr>
-            <w:tcW w:w="1814" w:type="dxa"/>
+            <w:tcW w:w="4082" w:type="dxa"/>
             <w:tcBorders>
               <w:top w:val="single" w:sz="4" w:space="0" w:color="auto"/>
               <w:left w:val="single" w:sz="4" w:space="0" w:color="auto"/>
+              <w:bottom w:val="single" w:sz="4" w:space="0" w:color="auto"/>
             </w:tcBorders>
-            <w:tcMar>
-              <w:top w:w="30" w:type="dxa"/>
-              <w:left w:w="50" w:type="dxa"/>
-              <w:bottom w:w="30" w:type="dxa"/>
-              <w:right w:w="50" w:type="dxa"/>
-            </w:tcMar>
+            <w:vAlign w:val="center"/>
           </w:tcPr>
           <w:p>
+            <w:pPr>
+              <w:jc w:val="center"/>
+            </w:pPr>
             <w:proofErr w:type="spellStart"/>
             <w:r>
               <w:rPr>
                 <w:b/>
               </w:rPr>
-              <w:t>Typ</w:t>
+              <w:t>Prvek</w:t>
             </w:r>
             <w:proofErr w:type="spellEnd"/>
           </w:p>
         </w:tc>
         <w:tc>
           <w:tcPr>
-            <w:tcW w:w="907" w:type="dxa"/>
+            <w:tcW w:w="2268" w:type="dxa"/>
             <w:tcBorders>
               <w:top w:val="single" w:sz="4" w:space="0" w:color="auto"/>
+              <w:bottom w:val="single" w:sz="4" w:space="0" w:color="auto"/>
             </w:tcBorders>
-            <w:tcMar>
-              <w:top w:w="30" w:type="dxa"/>
-              <w:left w:w="50" w:type="dxa"/>
-              <w:bottom w:w="30" w:type="dxa"/>
-              <w:right w:w="50" w:type="dxa"/>
-            </w:tcMar>
+            <w:vAlign w:val="center"/>
           </w:tcPr>
           <w:p>
-            <w:proofErr w:type="spellStart"/>
-            <w:r>
-              <w:rPr>
-                <w:b/>
-              </w:rPr>
-              <w:t>Počet</w:t>
-            </w:r>
-            <w:proofErr w:type="spellEnd"/>
+            <w:pPr>
+              <w:jc w:val="center"/>
+            </w:pPr>
           </w:p>
         </w:tc>
         <w:tc>
           <w:tcPr>
-            <w:tcW w:w="1361" w:type="dxa"/>
+            <w:tcW w:w="2835" w:type="dxa"/>
             <w:tcBorders>
               <w:top w:val="single" w:sz="4" w:space="0" w:color="auto"/>
+              <w:bottom w:val="single" w:sz="4" w:space="0" w:color="auto"/>
             </w:tcBorders>
-            <w:tcMar>
-              <w:top w:w="30" w:type="dxa"/>
-              <w:left w:w="50" w:type="dxa"/>
-              <w:bottom w:w="30" w:type="dxa"/>
-              <w:right w:w="50" w:type="dxa"/>
-            </w:tcMar>
+            <w:vAlign w:val="center"/>
           </w:tcPr>
           <w:p>
-            <w:proofErr w:type="spellStart"/>
-            <w:r>
-              <w:rPr>
-                <w:b/>
-              </w:rPr>
-              <w:t>Dimenze</w:t>
-            </w:r>
-            <w:proofErr w:type="spellEnd"/>
+            <w:pPr>
+              <w:jc w:val="center"/>
+            </w:pPr>
           </w:p>
         </w:tc>
         <w:tc>
           <w:tcPr>
-            <w:tcW w:w="1020" w:type="dxa"/>
+            <w:tcW w:w="1701" w:type="dxa"/>
             <w:tcBorders>
               <w:top w:val="single" w:sz="4" w:space="0" w:color="auto"/>
+              <w:bottom w:val="single" w:sz="4" w:space="0" w:color="auto"/>
+              <w:right w:val="single" w:sz="4" w:space="0" w:color="auto"/>
             </w:tcBorders>
-            <w:tcMar>
-              <w:top w:w="30" w:type="dxa"/>
-              <w:left w:w="50" w:type="dxa"/>
-              <w:bottom w:w="30" w:type="dxa"/>
-              <w:right w:w="50" w:type="dxa"/>
-            </w:tcMar>
+            <w:vAlign w:val="center"/>
           </w:tcPr>
           <w:p>
+            <w:pPr>
+              <w:jc w:val="center"/>
+            </w:pPr>
+            <w:proofErr w:type="spellStart"/>
             <w:r>
               <w:rPr>
                 <w:b/>
               </w:rPr>
-              <w:t>Riso</w:t>
-            </w:r>
-          </w:p>
-        </w:tc>
-        <w:tc>
-          <w:tcPr>
-            <w:tcW w:w="1474" w:type="dxa"/>
-            <w:tcBorders>
-              <w:top w:val="single" w:sz="4" w:space="0" w:color="auto"/>
-            </w:tcBorders>
-            <w:tcMar>
-              <w:top w:w="30" w:type="dxa"/>
-              <w:left w:w="50" w:type="dxa"/>
-              <w:bottom w:w="30" w:type="dxa"/>
-              <w:right w:w="50" w:type="dxa"/>
-            </w:tcMar>
-          </w:tcPr>
-          <w:p>
-            <w:proofErr w:type="spellStart"/>
+              <w:t>Pozn</w:t>
+            </w:r>
+            <w:proofErr w:type="spellEnd"/>
             <w:r>
               <w:rPr>
                 <w:b/>
               </w:rPr>
-              <w:t>Ochrana</w:t>
-            </w:r>
-            <w:proofErr w:type="spellEnd"/>
-          </w:p>
-        </w:tc>
-        <w:tc>
-          <w:tcPr>
-            <w:tcW w:w="2721" w:type="dxa"/>
-            <w:tcBorders>
-              <w:top w:val="single" w:sz="4" w:space="0" w:color="auto"/>
-              <w:right w:val="single" w:sz="4" w:space="0" w:color="auto"/>
-            </w:tcBorders>
-            <w:tcMar>
-              <w:top w:w="30" w:type="dxa"/>
-              <w:left w:w="50" w:type="dxa"/>
-              <w:bottom w:w="30" w:type="dxa"/>
-              <w:right w:w="50" w:type="dxa"/>
-            </w:tcMar>
-          </w:tcPr>
-          <w:p>
-            <w:proofErr w:type="spellStart"/>
-            <w:r>
-              <w:rPr>
-                <w:b/>
-              </w:rPr>
-              <w:t>Podrobnosti</w:t>
-            </w:r>
-            <w:proofErr w:type="spellEnd"/>
+              <w:t>.</w:t>
+            </w:r>
           </w:p>
         </w:tc>
       </w:tr>
       <w:tr>
         <w:trPr>
-          <w:trHeight w:hRule="exact" w:val="284"/>
+          <w:jc w:val="center"/>
         </w:trPr>
         <w:tc>
           <w:tcPr>
-            <w:tcW w:w="1700" w:type="dxa"/>
+            <w:tcW w:w="4082" w:type="dxa"/>
             <w:tcBorders>
+              <w:top w:val="single" w:sz="4" w:space="0" w:color="auto"/>
               <w:left w:val="single" w:sz="4" w:space="0" w:color="auto"/>
               <w:bottom w:val="single" w:sz="4" w:space="0" w:color="auto"/>
             </w:tcBorders>
-            <w:tcMar>
-              <w:top w:w="20" w:type="dxa"/>
-              <w:left w:w="40" w:type="dxa"/>
-              <w:bottom w:w="20" w:type="dxa"/>
-              <w:right w:w="40" w:type="dxa"/>
-            </w:tcMar>
             <w:vAlign w:val="center"/>
           </w:tcPr>
           <w:p>
-            <w:r>
-              <w:t>{{#prvky}}{{typ}}</w:t>
+            <w:pPr>
+              <w:rPr>
+                <w:sz w:val="20"/>
+                <w:szCs w:val="20"/>
+              </w:rPr>
+            </w:pPr>
+            <w:r>
+              <w:rPr>
+                <w:sz w:val="20"/>
+                <w:szCs w:val="20"/>
+              </w:rPr>
+              <w:t>{{#prvky}}{{prvek_text}}</w:t>
+            </w:r>
+            <w:r>
+              <w:rPr>
+                <w:sz w:val="20"/>
+                <w:szCs w:val="20"/>
+              </w:rPr>
+              <w:br/>
+              <w:t>{{</w:t>
+            </w:r>
+            <w:proofErr w:type="spellStart"/>
+            <w:r>
+              <w:rPr>
+                <w:sz w:val="20"/>
+                <w:szCs w:val="20"/>
+              </w:rPr>
+              <w:t>prvek_subtext</w:t>
+            </w:r>
+            <w:proofErr w:type="spellEnd"/>
+            <w:r>
+              <w:rPr>
+                <w:sz w:val="20"/>
+                <w:szCs w:val="20"/>
+              </w:rPr>
+              <w:t>}}</w:t>
             </w:r>
           </w:p>
         </w:tc>
         <w:tc>
           <w:tcPr>
-            <w:tcW w:w="1700" w:type="dxa"/>
+            <w:tcW w:w="2268" w:type="dxa"/>
             <w:tcBorders>
+              <w:top w:val="single" w:sz="4" w:space="0" w:color="auto"/>
               <w:bottom w:val="single" w:sz="4" w:space="0" w:color="auto"/>
             </w:tcBorders>
-            <w:tcMar>
-              <w:top w:w="20" w:type="dxa"/>
-              <w:left w:w="40" w:type="dxa"/>
-              <w:bottom w:w="20" w:type="dxa"/>
-              <w:right w:w="40" w:type="dxa"/>
-            </w:tcMar>
             <w:vAlign w:val="center"/>
           </w:tcPr>
           <w:p>
-            <w:r>
+            <w:pPr>
+              <w:rPr>
+                <w:sz w:val="20"/>
+                <w:szCs w:val="20"/>
+              </w:rPr>
+            </w:pPr>
+            <w:r>
+              <w:rPr>
+                <w:sz w:val="20"/>
+                <w:szCs w:val="20"/>
+              </w:rPr>
               <w:t>{{</w:t>
             </w:r>
             <w:proofErr w:type="spellStart"/>
             <w:r>
-              <w:t>pocet</w:t>
+              <w:rPr>
+                <w:sz w:val="20"/>
+                <w:szCs w:val="20"/>
+              </w:rPr>
+              <w:t>parametry_text</w:t>
             </w:r>
             <w:proofErr w:type="spellEnd"/>
             <w:r>
+              <w:rPr>
+                <w:sz w:val="20"/>
+                <w:szCs w:val="20"/>
+              </w:rPr>
               <w:t>}}</w:t>
             </w:r>
           </w:p>
         </w:tc>
         <w:tc>
           <w:tcPr>
-            <w:tcW w:w="1700" w:type="dxa"/>
+            <w:tcW w:w="2835" w:type="dxa"/>
             <w:tcBorders>
+              <w:top w:val="single" w:sz="4" w:space="0" w:color="auto"/>
               <w:bottom w:val="single" w:sz="4" w:space="0" w:color="auto"/>
             </w:tcBorders>
-            <w:tcMar>
-              <w:top w:w="20" w:type="dxa"/>
-              <w:left w:w="40" w:type="dxa"/>
-              <w:bottom w:w="20" w:type="dxa"/>
-              <w:right w:w="40" w:type="dxa"/>
-            </w:tcMar>
             <w:vAlign w:val="center"/>
           </w:tcPr>
           <w:p>
-            <w:r>
+            <w:pPr>
+              <w:rPr>
+                <w:sz w:val="20"/>
+                <w:szCs w:val="20"/>
+              </w:rPr>
+            </w:pPr>
+            <w:r>
+              <w:rPr>
+                <w:sz w:val="20"/>
+                <w:szCs w:val="20"/>
+              </w:rPr>
               <w:t>{{</w:t>
             </w:r>
             <w:proofErr w:type="spellStart"/>
             <w:r>
-              <w:t>dimenze</w:t>
+              <w:rPr>
+                <w:sz w:val="20"/>
+                <w:szCs w:val="20"/>
+              </w:rPr>
+              <w:t>mereni_text</w:t>
             </w:r>
             <w:proofErr w:type="spellEnd"/>
             <w:r>
+              <w:rPr>
+                <w:sz w:val="20"/>
+                <w:szCs w:val="20"/>
+              </w:rPr>
               <w:t>}}</w:t>
             </w:r>
           </w:p>
         </w:tc>
         <w:tc>
           <w:tcPr>
-            <w:tcW w:w="1700" w:type="dxa"/>
+            <w:tcW w:w="1701" w:type="dxa"/>
             <w:tcBorders>
+              <w:top w:val="single" w:sz="4" w:space="0" w:color="auto"/>
               <w:bottom w:val="single" w:sz="4" w:space="0" w:color="auto"/>
+              <w:right w:val="single" w:sz="4" w:space="0" w:color="auto"/>
             </w:tcBorders>
-            <w:tcMar>
-              <w:top w:w="20" w:type="dxa"/>
-              <w:left w:w="40" w:type="dxa"/>
-              <w:bottom w:w="20" w:type="dxa"/>
-              <w:right w:w="40" w:type="dxa"/>
-            </w:tcMar>
             <w:vAlign w:val="center"/>
           </w:tcPr>
           <w:p>
-            <w:r>
+            <w:pPr>
+              <w:rPr>
+                <w:sz w:val="20"/>
+                <w:szCs w:val="20"/>
+              </w:rPr>
+            </w:pPr>
+            <w:r>
+              <w:rPr>
+                <w:sz w:val="20"/>
+                <w:szCs w:val="20"/>
+              </w:rPr>
               <w:t>{{</w:t>
             </w:r>
             <w:proofErr w:type="spellStart"/>
             <w:r>
-              <w:t>riso</w:t>
+              <w:rPr>
+                <w:sz w:val="20"/>
+                <w:szCs w:val="20"/>
+              </w:rPr>
+              <w:t>poznamka</w:t>
             </w:r>
             <w:proofErr w:type="spellEnd"/>
             <w:r>
-              <w:t>}}</w:t>
-            </w:r>
-          </w:p>
-        </w:tc>
-        <w:tc>
-          <w:tcPr>
-            <w:tcW w:w="1700" w:type="dxa"/>
-            <w:tcBorders>
-              <w:bottom w:val="single" w:sz="4" w:space="0" w:color="auto"/>
-            </w:tcBorders>
-            <w:tcMar>
-              <w:top w:w="20" w:type="dxa"/>
-              <w:left w:w="40" w:type="dxa"/>
-              <w:bottom w:w="20" w:type="dxa"/>
-              <w:right w:w="40" w:type="dxa"/>
-            </w:tcMar>
-            <w:vAlign w:val="center"/>
-          </w:tcPr>
-          <w:p>
-            <w:r>
-              <w:t>{{</w:t>
+              <w:rPr>
+                <w:sz w:val="20"/>
+                <w:szCs w:val="20"/>
+              </w:rPr>
+              <w:t>}}{{/</w:t>
             </w:r>
             <w:proofErr w:type="spellStart"/>
             <w:r>
-              <w:t>ochrana</w:t>
+              <w:rPr>
+                <w:sz w:val="20"/>
+                <w:szCs w:val="20"/>
+              </w:rPr>
+              <w:t>prvky</w:t>
             </w:r>
             <w:proofErr w:type="spellEnd"/>
             <w:r>
-              <w:t>}}</w:t>
-            </w:r>
-          </w:p>
-        </w:tc>
-        <w:tc>
-          <w:tcPr>
-            <w:tcW w:w="1700" w:type="dxa"/>
-            <w:tcBorders>
-              <w:bottom w:val="single" w:sz="4" w:space="0" w:color="auto"/>
-              <w:right w:val="single" w:sz="4" w:space="0" w:color="auto"/>
-            </w:tcBorders>
-            <w:tcMar>
-              <w:top w:w="20" w:type="dxa"/>
-              <w:left w:w="40" w:type="dxa"/>
-              <w:bottom w:w="20" w:type="dxa"/>
-              <w:right w:w="40" w:type="dxa"/>
-            </w:tcMar>
-            <w:vAlign w:val="center"/>
-          </w:tcPr>
-          <w:p>
-            <w:r>
-              <w:t>{{</w:t>
-            </w:r>
-            <w:proofErr w:type="spellStart"/>
-            <w:r>
-              <w:t>podrobnosti</w:t>
-            </w:r>
-            <w:proofErr w:type="spellEnd"/>
-            <w:r>
-              <w:t>}}{{/</w:t>
-            </w:r>
-            <w:proofErr w:type="spellStart"/>
-            <w:r>
-              <w:t>prvky</w:t>
-            </w:r>
-            <w:proofErr w:type="spellEnd"/>
-            <w:r>
+              <w:rPr>
+                <w:sz w:val="20"/>
+                <w:szCs w:val="20"/>
+              </w:rPr>
               <w:t>}}</w:t>
             </w:r>
           </w:p>

</xml_diff>

<commit_message>
Clean templates and improve mobile photo uploads
</commit_message>
<xml_diff>
--- a/revize-frontend/dist/templates/elektro_rz_template_compact_conditional_images_boxed.docx
+++ b/revize-frontend/dist/templates/elektro_rz_template_compact_conditional_images_boxed.docx
@@ -1144,7 +1144,15 @@
               <w:jc w:val="center"/>
             </w:pPr>
             <w:r>
-              <w:t>{{#merici_pristroje}}{{nazev}}</w:t>
+              <w:t>{{#merici_pristroje</w:t>
+            </w:r>
+            <w:proofErr w:type="gramStart"/>
+            <w:r>
+              <w:t>}}{</w:t>
+            </w:r>
+            <w:proofErr w:type="gramEnd"/>
+            <w:r>
+              <w:t>{nazev}}</w:t>
             </w:r>
           </w:p>
         </w:tc>
@@ -1171,11 +1179,16 @@
               <w:t>mereni</w:t>
             </w:r>
             <w:proofErr w:type="spellEnd"/>
+            <w:proofErr w:type="gramStart"/>
             <w:r>
               <w:t>}}</w:t>
             </w:r>
             <w:r>
-              <w:t xml:space="preserve">                                </w:t>
+              <w:t xml:space="preserve">   </w:t>
+            </w:r>
+            <w:proofErr w:type="gramEnd"/>
+            <w:r>
+              <w:t xml:space="preserve">                             </w:t>
             </w:r>
           </w:p>
         </w:tc>
@@ -1250,8 +1263,13 @@
               <w:t>platnost_kalibrace</w:t>
             </w:r>
             <w:proofErr w:type="spellEnd"/>
-            <w:r>
-              <w:t>}}{{/</w:t>
+            <w:proofErr w:type="gramStart"/>
+            <w:r>
+              <w:t>}}{</w:t>
+            </w:r>
+            <w:proofErr w:type="gramEnd"/>
+            <w:r>
+              <w:t>{/</w:t>
             </w:r>
             <w:proofErr w:type="spellStart"/>
             <w:r>
@@ -1592,11 +1610,16 @@
       </w:r>
       <w:proofErr w:type="spellEnd"/>
       <w:r>
-        <w:t xml:space="preserve">: ____________________  </w:t>
+        <w:t>: ___________________</w:t>
+      </w:r>
+      <w:proofErr w:type="gramStart"/>
+      <w:r>
+        <w:t xml:space="preserve">_  </w:t>
       </w:r>
       <w:r>
         <w:tab/>
       </w:r>
+      <w:proofErr w:type="gramEnd"/>
       <w:r>
         <w:tab/>
       </w:r>
@@ -2213,7 +2236,15 @@
               <w:jc w:val="center"/>
             </w:pPr>
             <w:r>
-              <w:t>{{#zkousky}}{{nazev}}</w:t>
+              <w:t>{{#zkousky</w:t>
+            </w:r>
+            <w:proofErr w:type="gramStart"/>
+            <w:r>
+              <w:t>}}{</w:t>
+            </w:r>
+            <w:proofErr w:type="gramEnd"/>
+            <w:r>
+              <w:t>{nazev}}</w:t>
             </w:r>
           </w:p>
         </w:tc>
@@ -2240,8 +2271,13 @@
               <w:t>poznamka</w:t>
             </w:r>
             <w:proofErr w:type="spellEnd"/>
-            <w:r>
-              <w:t>}}{{/</w:t>
+            <w:proofErr w:type="gramStart"/>
+            <w:r>
+              <w:t>}}{</w:t>
+            </w:r>
+            <w:proofErr w:type="gramEnd"/>
+            <w:r>
+              <w:t>{/</w:t>
             </w:r>
             <w:proofErr w:type="spellStart"/>
             <w:r>
@@ -2339,9 +2375,9 @@
       </w:tblPr>
       <w:tblGrid>
         <w:gridCol w:w="2597"/>
-        <w:gridCol w:w="3315"/>
-        <w:gridCol w:w="1878"/>
-        <w:gridCol w:w="2164"/>
+        <w:gridCol w:w="2850"/>
+        <w:gridCol w:w="1276"/>
+        <w:gridCol w:w="3231"/>
       </w:tblGrid>
       <w:tr>
         <w:trPr>
@@ -2387,7 +2423,7 @@
         </w:tc>
         <w:tc>
           <w:tcPr>
-            <w:tcW w:w="0" w:type="auto"/>
+            <w:tcW w:w="2850" w:type="dxa"/>
             <w:tcMar>
               <w:top w:w="40" w:type="dxa"/>
               <w:left w:w="60" w:type="dxa"/>
@@ -2430,7 +2466,7 @@
         </w:tc>
         <w:tc>
           <w:tcPr>
-            <w:tcW w:w="0" w:type="auto"/>
+            <w:tcW w:w="1276" w:type="dxa"/>
             <w:vAlign w:val="center"/>
           </w:tcPr>
           <w:p>
@@ -2460,7 +2496,7 @@
         </w:tc>
         <w:tc>
           <w:tcPr>
-            <w:tcW w:w="0" w:type="auto"/>
+            <w:tcW w:w="3231" w:type="dxa"/>
             <w:vAlign w:val="center"/>
           </w:tcPr>
           <w:p>
@@ -2540,7 +2576,7 @@
         </w:tc>
         <w:tc>
           <w:tcPr>
-            <w:tcW w:w="0" w:type="auto"/>
+            <w:tcW w:w="2850" w:type="dxa"/>
             <w:tcMar>
               <w:top w:w="40" w:type="dxa"/>
               <w:left w:w="60" w:type="dxa"/>
@@ -2583,7 +2619,7 @@
         </w:tc>
         <w:tc>
           <w:tcPr>
-            <w:tcW w:w="0" w:type="auto"/>
+            <w:tcW w:w="1276" w:type="dxa"/>
             <w:vAlign w:val="center"/>
           </w:tcPr>
           <w:p>
@@ -2615,7 +2651,7 @@
         </w:tc>
         <w:tc>
           <w:tcPr>
-            <w:tcW w:w="0" w:type="auto"/>
+            <w:tcW w:w="3231" w:type="dxa"/>
             <w:vAlign w:val="center"/>
           </w:tcPr>
           <w:p>
@@ -2713,7 +2749,7 @@
         </w:tc>
         <w:tc>
           <w:tcPr>
-            <w:tcW w:w="0" w:type="auto"/>
+            <w:tcW w:w="2850" w:type="dxa"/>
             <w:tcMar>
               <w:top w:w="40" w:type="dxa"/>
               <w:left w:w="60" w:type="dxa"/>
@@ -2756,7 +2792,7 @@
         </w:tc>
         <w:tc>
           <w:tcPr>
-            <w:tcW w:w="0" w:type="auto"/>
+            <w:tcW w:w="1276" w:type="dxa"/>
             <w:vAlign w:val="center"/>
           </w:tcPr>
           <w:p>
@@ -2788,7 +2824,7 @@
         </w:tc>
         <w:tc>
           <w:tcPr>
-            <w:tcW w:w="0" w:type="auto"/>
+            <w:tcW w:w="3231" w:type="dxa"/>
             <w:vAlign w:val="center"/>
           </w:tcPr>
           <w:p>
@@ -2876,7 +2912,7 @@
         </w:tc>
         <w:tc>
           <w:tcPr>
-            <w:tcW w:w="0" w:type="auto"/>
+            <w:tcW w:w="2850" w:type="dxa"/>
             <w:tcMar>
               <w:top w:w="40" w:type="dxa"/>
               <w:left w:w="60" w:type="dxa"/>
@@ -2919,7 +2955,7 @@
         </w:tc>
         <w:tc>
           <w:tcPr>
-            <w:tcW w:w="0" w:type="auto"/>
+            <w:tcW w:w="1276" w:type="dxa"/>
           </w:tcPr>
           <w:p>
             <w:pPr>
@@ -2932,7 +2968,7 @@
         </w:tc>
         <w:tc>
           <w:tcPr>
-            <w:tcW w:w="0" w:type="auto"/>
+            <w:tcW w:w="3231" w:type="dxa"/>
           </w:tcPr>
           <w:p>
             <w:pPr>
@@ -3124,7 +3160,23 @@
                 <w:sz w:val="20"/>
                 <w:szCs w:val="20"/>
               </w:rPr>
-              <w:t>{{#komponenty}}{{nazev}}</w:t>
+              <w:t>{{#komponenty</w:t>
+            </w:r>
+            <w:proofErr w:type="gramStart"/>
+            <w:r>
+              <w:rPr>
+                <w:sz w:val="20"/>
+                <w:szCs w:val="20"/>
+              </w:rPr>
+              <w:t>}}{</w:t>
+            </w:r>
+            <w:proofErr w:type="gramEnd"/>
+            <w:r>
+              <w:rPr>
+                <w:sz w:val="20"/>
+                <w:szCs w:val="20"/>
+              </w:rPr>
+              <w:t>{nazev}}</w:t>
             </w:r>
             <w:r>
               <w:rPr>
@@ -3267,12 +3319,21 @@
               <w:t>poznamka</w:t>
             </w:r>
             <w:proofErr w:type="spellEnd"/>
+            <w:proofErr w:type="gramStart"/>
             <w:r>
               <w:rPr>
                 <w:sz w:val="20"/>
                 <w:szCs w:val="20"/>
               </w:rPr>
-              <w:t>}}{{/</w:t>
+              <w:t>}}{</w:t>
+            </w:r>
+            <w:proofErr w:type="gramEnd"/>
+            <w:r>
+              <w:rPr>
+                <w:sz w:val="20"/>
+                <w:szCs w:val="20"/>
+              </w:rPr>
+              <w:t>{/</w:t>
             </w:r>
             <w:proofErr w:type="spellStart"/>
             <w:r>
@@ -3507,7 +3568,23 @@
                 <w:sz w:val="20"/>
                 <w:szCs w:val="20"/>
               </w:rPr>
-              <w:t>{{#prvky}}{{prvek_text}}</w:t>
+              <w:t>{{#prvky</w:t>
+            </w:r>
+            <w:proofErr w:type="gramStart"/>
+            <w:r>
+              <w:rPr>
+                <w:sz w:val="20"/>
+                <w:szCs w:val="20"/>
+              </w:rPr>
+              <w:t>}}{</w:t>
+            </w:r>
+            <w:proofErr w:type="gramEnd"/>
+            <w:r>
+              <w:rPr>
+                <w:sz w:val="20"/>
+                <w:szCs w:val="20"/>
+              </w:rPr>
+              <w:t>{prvek_text}}</w:t>
             </w:r>
             <w:r>
               <w:rPr>
@@ -3650,12 +3727,21 @@
               <w:t>poznamka</w:t>
             </w:r>
             <w:proofErr w:type="spellEnd"/>
+            <w:proofErr w:type="gramStart"/>
             <w:r>
               <w:rPr>
                 <w:sz w:val="20"/>
                 <w:szCs w:val="20"/>
               </w:rPr>
-              <w:t>}}{{/</w:t>
+              <w:t>}}{</w:t>
+            </w:r>
+            <w:proofErr w:type="gramEnd"/>
+            <w:r>
+              <w:rPr>
+                <w:sz w:val="20"/>
+                <w:szCs w:val="20"/>
+              </w:rPr>
+              <w:t>{/</w:t>
             </w:r>
             <w:proofErr w:type="spellStart"/>
             <w:r>
@@ -3701,19 +3787,34 @@
         </w:rPr>
         <w:t xml:space="preserve">5) </w:t>
       </w:r>
+      <w:proofErr w:type="spellStart"/>
       <w:r>
         <w:rPr>
           <w:b/>
           <w:sz w:val="26"/>
         </w:rPr>
-        <w:t>Z?vady</w:t>
-      </w:r>
+        <w:t>Z</w:t>
+      </w:r>
+      <w:r>
+        <w:rPr>
+          <w:b/>
+          <w:sz w:val="26"/>
+        </w:rPr>
+        <w:t>á</w:t>
+      </w:r>
+      <w:r>
+        <w:rPr>
+          <w:b/>
+          <w:sz w:val="26"/>
+        </w:rPr>
+        <w:t>vady</w:t>
+      </w:r>
+      <w:proofErr w:type="spellEnd"/>
     </w:p>
     <w:tbl>
       <w:tblPr>
         <w:tblW w:w="10969" w:type="dxa"/>
         <w:tblInd w:w="38" w:type="dxa"/>
-        <w:tblLayout w:type="fixed"/>
         <w:tblBorders>
           <w:top w:val="single" w:sz="10" w:space="0" w:color="64748B"/>
           <w:left w:val="single" w:sz="10" w:space="0" w:color="64748B"/>
@@ -3722,6 +3823,7 @@
           <w:insideH w:val="nil"/>
           <w:insideV w:val="nil"/>
         </w:tblBorders>
+        <w:tblLayout w:type="fixed"/>
         <w:tblLook w:val="04A0" w:firstRow="1" w:lastRow="0" w:firstColumn="1" w:lastColumn="0" w:noHBand="0" w:noVBand="1"/>
       </w:tblPr>
       <w:tblGrid>
@@ -3748,21 +3850,25 @@
               <w:spacing w:after="140"/>
               <w:rPr>
                 <w:sz w:val="22"/>
-                <w:szCs w:val="22"/>
               </w:rPr>
             </w:pPr>
             <w:r>
               <w:rPr>
+                <w:sz w:val="24"/>
+                <w:szCs w:val="24"/>
+              </w:rPr>
+              <w:t xml:space="preserve">{{poradi}}. </w:t>
+            </w:r>
+            <w:r>
+              <w:rPr>
                 <w:sz w:val="22"/>
-                <w:szCs w:val="22"/>
               </w:rPr>
-              <w:t>{{poradi}}. {{popis_text}}</w:t>
+              <w:t>{{popis_text}}</w:t>
             </w:r>
             <w:r>
               <w:rPr>
                 <w:b/>
                 <w:sz w:val="22"/>
-                <w:szCs w:val="22"/>
               </w:rPr>
               <w:t xml:space="preserve"> {{popis_suffix}}</w:t>
             </w:r>
@@ -3770,7 +3876,6 @@
           <w:tbl>
             <w:tblPr>
               <w:tblW w:w="0" w:type="auto"/>
-              <w:tblLayout w:type="fixed"/>
               <w:tblBorders>
                 <w:top w:val="nil"/>
                 <w:left w:val="nil"/>
@@ -3779,6 +3884,7 @@
                 <w:insideH w:val="nil"/>
                 <w:insideV w:val="nil"/>
               </w:tblBorders>
+              <w:tblLayout w:type="fixed"/>
               <w:tblLook w:val="04A0" w:firstRow="1" w:lastRow="0" w:firstColumn="1" w:lastColumn="0" w:noHBand="0" w:noVBand="1"/>
             </w:tblPr>
             <w:tblGrid>
@@ -3824,8 +3930,8 @@
                 </w:p>
                 <w:p>
                   <w:pPr>
+                    <w:spacing w:before="40" w:after="0"/>
                     <w:jc w:val="center"/>
-                    <w:spacing w:before="40" w:after="0"/>
                   </w:pPr>
                   <w:r>
                     <w:rPr>
@@ -3856,8 +3962,8 @@
                 </w:p>
                 <w:p>
                   <w:pPr>
+                    <w:spacing w:before="40" w:after="0"/>
                     <w:jc w:val="center"/>
-                    <w:spacing w:before="40" w:after="0"/>
                   </w:pPr>
                   <w:r>
                     <w:rPr>
@@ -3890,10 +3996,10 @@
           </w:tbl>
           <w:p>
             <w:pPr>
-              <w:spacing w:before="80" w:after="180"/>
               <w:pBdr>
                 <w:bottom w:val="single" w:sz="4" w:space="1" w:color="CBD5E1"/>
               </w:pBdr>
+              <w:spacing w:before="80" w:after="180"/>
             </w:pPr>
             <w:r>
               <w:t xml:space="preserve"> </w:t>

</xml_diff>

<commit_message>
Polish dashboard export and fix Word template rendering
</commit_message>
<xml_diff>
--- a/revize-frontend/dist/templates/elektro_rz_template_compact_conditional_images_boxed.docx
+++ b/revize-frontend/dist/templates/elektro_rz_template_compact_conditional_images_boxed.docx
@@ -1,6 +1,6 @@
 
 <file path=word/document.xml><?xml version="1.0" encoding="utf-8"?>
-<w:document xmlns:wpc="http://schemas.microsoft.com/office/word/2010/wordprocessingCanvas" xmlns:cx="http://schemas.microsoft.com/office/drawing/2014/chartex" xmlns:cx1="http://schemas.microsoft.com/office/drawing/2015/9/8/chartex" xmlns:cx2="http://schemas.microsoft.com/office/drawing/2015/10/21/chartex" xmlns:cx3="http://schemas.microsoft.com/office/drawing/2016/5/9/chartex" xmlns:cx4="http://schemas.microsoft.com/office/drawing/2016/5/10/chartex" xmlns:cx5="http://schemas.microsoft.com/office/drawing/2016/5/11/chartex" xmlns:cx6="http://schemas.microsoft.com/office/drawing/2016/5/12/chartex" xmlns:cx7="http://schemas.microsoft.com/office/drawing/2016/5/13/chartex" xmlns:cx8="http://schemas.microsoft.com/office/drawing/2016/5/14/chartex" xmlns:mc="http://schemas.openxmlformats.org/markup-compatibility/2006" xmlns:aink="http://schemas.microsoft.com/office/drawing/2016/ink" xmlns:am3d="http://schemas.microsoft.com/office/drawing/2017/model3d" xmlns:o="urn:schemas-microsoft-com:office:office" xmlns:oel="http://schemas.microsoft.com/office/2019/extlst" xmlns:r="http://schemas.openxmlformats.org/officeDocument/2006/relationships" xmlns:m="http://schemas.openxmlformats.org/officeDocument/2006/math" xmlns:v="urn:schemas-microsoft-com:vml" xmlns:wp14="http://schemas.microsoft.com/office/word/2010/wordprocessingDrawing" xmlns:wp="http://schemas.openxmlformats.org/drawingml/2006/wordprocessingDrawing" xmlns:w10="urn:schemas-microsoft-com:office:word" xmlns:w="http://schemas.openxmlformats.org/wordprocessingml/2006/main" xmlns:w14="http://schemas.microsoft.com/office/word/2010/wordml" xmlns:w15="http://schemas.microsoft.com/office/word/2012/wordml" xmlns:w16cex="http://schemas.microsoft.com/office/word/2018/wordml/cex" xmlns:w16cid="http://schemas.microsoft.com/office/word/2016/wordml/cid" xmlns:w16="http://schemas.microsoft.com/office/word/2018/wordml" xmlns:w16du="http://schemas.microsoft.com/office/word/2023/wordml/word16du" xmlns:w16sdtdh="http://schemas.microsoft.com/office/word/2020/wordml/sdtdatahash" xmlns:w16sdtfl="http://schemas.microsoft.com/office/word/2024/wordml/sdtformatlock" xmlns:w16se="http://schemas.microsoft.com/office/word/2015/wordml/symex" xmlns:wpg="http://schemas.microsoft.com/office/word/2010/wordprocessingGroup" xmlns:wpi="http://schemas.microsoft.com/office/word/2010/wordprocessingInk" xmlns:wne="http://schemas.microsoft.com/office/word/2006/wordml" xmlns:wps="http://schemas.microsoft.com/office/word/2010/wordprocessingShape" mc:Ignorable="w14 w15 w16se w16cid w16 w16cex w16sdtdh w16sdtfl w16du wp14">
+<w:document xmlns:mc="http://schemas.openxmlformats.org/markup-compatibility/2006" xmlns:r="http://schemas.openxmlformats.org/officeDocument/2006/relationships" xmlns:w="http://schemas.openxmlformats.org/wordprocessingml/2006/main" xmlns:w14="http://schemas.microsoft.com/office/word/2010/wordml" xmlns:wp="http://schemas.openxmlformats.org/drawingml/2006/wordprocessingDrawing" mc:Ignorable="w14 w15 w16se w16cid w16 w16cex w16sdtdh w16sdtfl w16du wp14">
   <w:body>
     <w:p>
       <w:pPr>
@@ -978,7 +978,6 @@
         <w:gridCol w:w="1131"/>
         <w:gridCol w:w="974"/>
         <w:gridCol w:w="1465"/>
-        <w:gridCol w:w="3629"/>
       </w:tblGrid>
       <w:tr>
         <w:tc>
@@ -1101,31 +1100,6 @@
             </w:r>
           </w:p>
         </w:tc>
-        <w:tc>
-          <w:tcPr>
-            <w:tcW w:w="1804" w:type="pct"/>
-            <w:tcMar>
-              <w:top w:w="30" w:type="dxa"/>
-              <w:left w:w="50" w:type="dxa"/>
-              <w:bottom w:w="30" w:type="dxa"/>
-              <w:right w:w="50" w:type="dxa"/>
-            </w:tcMar>
-            <w:vAlign w:val="center"/>
-          </w:tcPr>
-          <w:p>
-            <w:pPr>
-              <w:jc w:val="center"/>
-            </w:pPr>
-            <w:proofErr w:type="spellStart"/>
-            <w:r>
-              <w:rPr>
-                <w:b/>
-              </w:rPr>
-              <w:t>Platnost</w:t>
-            </w:r>
-            <w:proofErr w:type="spellEnd"/>
-          </w:p>
-        </w:tc>
       </w:tr>
       <w:tr>
         <w:tc>
@@ -1144,15 +1118,7 @@
               <w:jc w:val="center"/>
             </w:pPr>
             <w:r>
-              <w:t>{{#merici_pristroje</w:t>
-            </w:r>
-            <w:proofErr w:type="gramStart"/>
-            <w:r>
-              <w:t>}}{</w:t>
-            </w:r>
-            <w:proofErr w:type="gramEnd"/>
-            <w:r>
-              <w:t>{nazev}}</w:t>
+              <w:t>{{#merici_pristroje}}{{nazev}}</w:t>
             </w:r>
           </w:p>
         </w:tc>
@@ -1228,56 +1194,7 @@
               <w:jc w:val="center"/>
             </w:pPr>
             <w:r>
-              <w:t>{{</w:t>
-            </w:r>
-            <w:proofErr w:type="spellStart"/>
-            <w:r>
-              <w:t>kalibrace</w:t>
-            </w:r>
-            <w:proofErr w:type="spellEnd"/>
-            <w:r>
-              <w:t>}}</w:t>
-            </w:r>
-          </w:p>
-        </w:tc>
-        <w:tc>
-          <w:tcPr>
-            <w:tcW w:w="1804" w:type="pct"/>
-            <w:tcMar>
-              <w:top w:w="20" w:type="dxa"/>
-              <w:left w:w="40" w:type="dxa"/>
-              <w:bottom w:w="20" w:type="dxa"/>
-              <w:right w:w="40" w:type="dxa"/>
-            </w:tcMar>
-            <w:vAlign w:val="center"/>
-          </w:tcPr>
-          <w:p>
-            <w:pPr>
-              <w:jc w:val="center"/>
-            </w:pPr>
-            <w:r>
-              <w:t>{{</w:t>
-            </w:r>
-            <w:proofErr w:type="spellStart"/>
-            <w:r>
-              <w:t>platnost_kalibrace</w:t>
-            </w:r>
-            <w:proofErr w:type="spellEnd"/>
-            <w:proofErr w:type="gramStart"/>
-            <w:r>
-              <w:t>}}{</w:t>
-            </w:r>
-            <w:proofErr w:type="gramEnd"/>
-            <w:r>
-              <w:t>{/</w:t>
-            </w:r>
-            <w:proofErr w:type="spellStart"/>
-            <w:r>
-              <w:t>merici_pristroje</w:t>
-            </w:r>
-            <w:proofErr w:type="spellEnd"/>
-            <w:r>
-              <w:t>}}</w:t>
+              <w:t>{{kalibrace}}{{/merici_pristroje}}</w:t>
             </w:r>
           </w:p>
         </w:tc>
@@ -3813,7 +3730,7 @@
     </w:p>
     <w:tbl>
       <w:tblPr>
-        <w:tblW w:w="10969" w:type="dxa"/>
+        <w:tblW w:w="10454" w:type="dxa"/>
         <w:tblInd w:w="38" w:type="dxa"/>
         <w:tblBorders>
           <w:top w:val="single" w:sz="10" w:space="0" w:color="64748B"/>
@@ -3827,12 +3744,15 @@
         <w:tblLook w:val="04A0" w:firstRow="1" w:lastRow="0" w:firstColumn="1" w:lastColumn="0" w:noHBand="0" w:noVBand="1"/>
       </w:tblPr>
       <w:tblGrid>
-        <w:gridCol w:w="10969"/>
+        <w:gridCol w:w="10454"/>
       </w:tblGrid>
       <w:tr>
+        <w:trPr>
+          <w:trHeight w:val="2838"/>
+        </w:trPr>
         <w:tc>
           <w:tcPr>
-            <w:tcW w:w="10969" w:type="dxa"/>
+            <w:tcW w:w="10454" w:type="dxa"/>
             <w:tcMar>
               <w:top w:w="120" w:type="dxa"/>
               <w:left w:w="140" w:type="dxa"/>
@@ -3888,13 +3808,16 @@
               <w:tblLook w:val="04A0" w:firstRow="1" w:lastRow="0" w:firstColumn="1" w:lastColumn="0" w:noHBand="0" w:noVBand="1"/>
             </w:tblPr>
             <w:tblGrid>
-              <w:gridCol w:w="4680"/>
-              <w:gridCol w:w="4680"/>
+              <w:gridCol w:w="4460"/>
+              <w:gridCol w:w="4460"/>
             </w:tblGrid>
             <w:tr>
+              <w:trPr>
+                <w:trHeight w:val="305"/>
+              </w:trPr>
               <w:tc>
                 <w:tcPr>
-                  <w:tcW w:w="4680" w:type="dxa"/>
+                  <w:tcW w:w="4460" w:type="dxa"/>
                 </w:tcPr>
                 <w:p>
                   <w:r>
@@ -3904,15 +3827,18 @@
               </w:tc>
               <w:tc>
                 <w:tcPr>
-                  <w:tcW w:w="4680" w:type="dxa"/>
+                  <w:tcW w:w="4460" w:type="dxa"/>
                 </w:tcPr>
                 <w:p/>
               </w:tc>
             </w:tr>
             <w:tr>
+              <w:trPr>
+                <w:trHeight w:val="501"/>
+              </w:trPr>
               <w:tc>
                 <w:tcPr>
-                  <w:tcW w:w="4680" w:type="dxa"/>
+                  <w:tcW w:w="4460" w:type="dxa"/>
                   <w:tcMar>
                     <w:top w:w="60" w:type="dxa"/>
                     <w:left w:w="40" w:type="dxa"/>
@@ -3925,7 +3851,7 @@
                     <w:jc w:val="center"/>
                   </w:pPr>
                   <w:r>
-                    <w:t>{{%%leva_image}}</w:t>
+                    <w:t>{{%leva_image}}</w:t>
                   </w:r>
                 </w:p>
                 <w:p>
@@ -3944,7 +3870,7 @@
               </w:tc>
               <w:tc>
                 <w:tcPr>
-                  <w:tcW w:w="4680" w:type="dxa"/>
+                  <w:tcW w:w="4460" w:type="dxa"/>
                   <w:tcMar>
                     <w:top w:w="60" w:type="dxa"/>
                     <w:left w:w="40" w:type="dxa"/>
@@ -3957,7 +3883,7 @@
                     <w:jc w:val="center"/>
                   </w:pPr>
                   <w:r>
-                    <w:t>{{%%prava_image}}</w:t>
+                    <w:t>{{%prava_image}}</w:t>
                   </w:r>
                 </w:p>
                 <w:p>
@@ -3976,9 +3902,12 @@
               </w:tc>
             </w:tr>
             <w:tr>
+              <w:trPr>
+                <w:trHeight w:val="293"/>
+              </w:trPr>
               <w:tc>
                 <w:tcPr>
-                  <w:tcW w:w="4680" w:type="dxa"/>
+                  <w:tcW w:w="4460" w:type="dxa"/>
                 </w:tcPr>
                 <w:p>
                   <w:r>
@@ -3988,7 +3917,7 @@
               </w:tc>
               <w:tc>
                 <w:tcPr>
-                  <w:tcW w:w="4680" w:type="dxa"/>
+                  <w:tcW w:w="4460" w:type="dxa"/>
                 </w:tcPr>
                 <w:p/>
               </w:tc>

</xml_diff>

<commit_message>
Improve defect workflow and refresh LPS template
</commit_message>
<xml_diff>
--- a/revize-frontend/dist/templates/elektro_rz_template_compact_conditional_images_boxed.docx
+++ b/revize-frontend/dist/templates/elektro_rz_template_compact_conditional_images_boxed.docx
@@ -1,6 +1,6 @@
 
 <file path=word/document.xml><?xml version="1.0" encoding="utf-8"?>
-<w:document xmlns:mc="http://schemas.openxmlformats.org/markup-compatibility/2006" xmlns:r="http://schemas.openxmlformats.org/officeDocument/2006/relationships" xmlns:w="http://schemas.openxmlformats.org/wordprocessingml/2006/main" xmlns:w14="http://schemas.microsoft.com/office/word/2010/wordml" xmlns:wp="http://schemas.openxmlformats.org/drawingml/2006/wordprocessingDrawing" mc:Ignorable="w14 w15 w16se w16cid w16 w16cex w16sdtdh w16sdtfl w16du wp14">
+<w:document xmlns:wpc="http://schemas.microsoft.com/office/word/2010/wordprocessingCanvas" xmlns:cx="http://schemas.microsoft.com/office/drawing/2014/chartex" xmlns:cx1="http://schemas.microsoft.com/office/drawing/2015/9/8/chartex" xmlns:cx2="http://schemas.microsoft.com/office/drawing/2015/10/21/chartex" xmlns:cx3="http://schemas.microsoft.com/office/drawing/2016/5/9/chartex" xmlns:cx4="http://schemas.microsoft.com/office/drawing/2016/5/10/chartex" xmlns:cx5="http://schemas.microsoft.com/office/drawing/2016/5/11/chartex" xmlns:cx6="http://schemas.microsoft.com/office/drawing/2016/5/12/chartex" xmlns:cx7="http://schemas.microsoft.com/office/drawing/2016/5/13/chartex" xmlns:cx8="http://schemas.microsoft.com/office/drawing/2016/5/14/chartex" xmlns:mc="http://schemas.openxmlformats.org/markup-compatibility/2006" xmlns:aink="http://schemas.microsoft.com/office/drawing/2016/ink" xmlns:am3d="http://schemas.microsoft.com/office/drawing/2017/model3d" xmlns:o="urn:schemas-microsoft-com:office:office" xmlns:oel="http://schemas.microsoft.com/office/2019/extlst" xmlns:r="http://schemas.openxmlformats.org/officeDocument/2006/relationships" xmlns:m="http://schemas.openxmlformats.org/officeDocument/2006/math" xmlns:v="urn:schemas-microsoft-com:vml" xmlns:wp14="http://schemas.microsoft.com/office/word/2010/wordprocessingDrawing" xmlns:wp="http://schemas.openxmlformats.org/drawingml/2006/wordprocessingDrawing" xmlns:w10="urn:schemas-microsoft-com:office:word" xmlns:w="http://schemas.openxmlformats.org/wordprocessingml/2006/main" xmlns:w14="http://schemas.microsoft.com/office/word/2010/wordml" xmlns:w15="http://schemas.microsoft.com/office/word/2012/wordml" xmlns:w16cex="http://schemas.microsoft.com/office/word/2018/wordml/cex" xmlns:w16cid="http://schemas.microsoft.com/office/word/2016/wordml/cid" xmlns:w16="http://schemas.microsoft.com/office/word/2018/wordml" xmlns:w16du="http://schemas.microsoft.com/office/word/2023/wordml/word16du" xmlns:w16sdtdh="http://schemas.microsoft.com/office/word/2020/wordml/sdtdatahash" xmlns:w16sdtfl="http://schemas.microsoft.com/office/word/2024/wordml/sdtformatlock" xmlns:w16se="http://schemas.microsoft.com/office/word/2015/wordml/symex" xmlns:wpg="http://schemas.microsoft.com/office/word/2010/wordprocessingGroup" xmlns:wpi="http://schemas.microsoft.com/office/word/2010/wordprocessingInk" xmlns:wne="http://schemas.microsoft.com/office/word/2006/wordml" xmlns:wps="http://schemas.microsoft.com/office/word/2010/wordprocessingShape" mc:Ignorable="w14 w15 w16se w16cid w16 w16cex w16sdtdh w16sdtfl w16du wp14">
   <w:body>
     <w:p>
       <w:pPr>
@@ -432,10 +432,10 @@
         <w:tblLook w:val="04A0" w:firstRow="1" w:lastRow="0" w:firstColumn="1" w:lastColumn="0" w:noHBand="0" w:noVBand="1"/>
       </w:tblPr>
       <w:tblGrid>
-        <w:gridCol w:w="1504"/>
-        <w:gridCol w:w="3702"/>
-        <w:gridCol w:w="2557"/>
-        <w:gridCol w:w="2557"/>
+        <w:gridCol w:w="1492"/>
+        <w:gridCol w:w="3658"/>
+        <w:gridCol w:w="2513"/>
+        <w:gridCol w:w="2537"/>
       </w:tblGrid>
       <w:tr>
         <w:tc>
@@ -974,15 +974,15 @@
         <w:tblLook w:val="04A0" w:firstRow="1" w:lastRow="0" w:firstColumn="1" w:lastColumn="0" w:noHBand="0" w:noVBand="1"/>
       </w:tblPr>
       <w:tblGrid>
-        <w:gridCol w:w="2860"/>
-        <w:gridCol w:w="1131"/>
-        <w:gridCol w:w="974"/>
-        <w:gridCol w:w="1465"/>
+        <w:gridCol w:w="2567"/>
+        <w:gridCol w:w="3248"/>
+        <w:gridCol w:w="1328"/>
+        <w:gridCol w:w="2818"/>
       </w:tblGrid>
       <w:tr>
         <w:tc>
           <w:tcPr>
-            <w:tcW w:w="1421" w:type="pct"/>
+            <w:tcW w:w="1293" w:type="pct"/>
             <w:tcMar>
               <w:top w:w="30" w:type="dxa"/>
               <w:left w:w="50" w:type="dxa"/>
@@ -1007,7 +1007,7 @@
         </w:tc>
         <w:tc>
           <w:tcPr>
-            <w:tcW w:w="562" w:type="pct"/>
+            <w:tcW w:w="1635" w:type="pct"/>
             <w:tcMar>
               <w:top w:w="30" w:type="dxa"/>
               <w:left w:w="50" w:type="dxa"/>
@@ -1032,7 +1032,7 @@
         </w:tc>
         <w:tc>
           <w:tcPr>
-            <w:tcW w:w="484" w:type="pct"/>
+            <w:tcW w:w="671" w:type="pct"/>
             <w:tcMar>
               <w:top w:w="30" w:type="dxa"/>
               <w:left w:w="50" w:type="dxa"/>
@@ -1071,7 +1071,7 @@
         </w:tc>
         <w:tc>
           <w:tcPr>
-            <w:tcW w:w="728" w:type="pct"/>
+            <w:tcW w:w="1401" w:type="pct"/>
             <w:tcMar>
               <w:top w:w="30" w:type="dxa"/>
               <w:left w:w="50" w:type="dxa"/>
@@ -1104,7 +1104,7 @@
       <w:tr>
         <w:tc>
           <w:tcPr>
-            <w:tcW w:w="1421" w:type="pct"/>
+            <w:tcW w:w="1293" w:type="pct"/>
             <w:tcMar>
               <w:top w:w="20" w:type="dxa"/>
               <w:left w:w="40" w:type="dxa"/>
@@ -1124,7 +1124,7 @@
         </w:tc>
         <w:tc>
           <w:tcPr>
-            <w:tcW w:w="562" w:type="pct"/>
+            <w:tcW w:w="1635" w:type="pct"/>
             <w:tcMar>
               <w:top w:w="20" w:type="dxa"/>
               <w:left w:w="40" w:type="dxa"/>
@@ -1160,7 +1160,7 @@
         </w:tc>
         <w:tc>
           <w:tcPr>
-            <w:tcW w:w="484" w:type="pct"/>
+            <w:tcW w:w="671" w:type="pct"/>
             <w:tcMar>
               <w:top w:w="20" w:type="dxa"/>
               <w:left w:w="40" w:type="dxa"/>
@@ -1180,7 +1180,7 @@
         </w:tc>
         <w:tc>
           <w:tcPr>
-            <w:tcW w:w="728" w:type="pct"/>
+            <w:tcW w:w="1401" w:type="pct"/>
             <w:tcMar>
               <w:top w:w="20" w:type="dxa"/>
               <w:left w:w="40" w:type="dxa"/>
@@ -2060,7 +2060,7 @@
         <w:tabs>
           <w:tab w:val="left" w:pos="0"/>
         </w:tabs>
-        <w:ind w:left="3828" w:firstLine="141"/>
+        <w:ind w:left="2835" w:firstLine="141"/>
         <w:jc w:val="both"/>
       </w:pPr>
       <w:r>
@@ -2072,7 +2072,7 @@
         <w:tabs>
           <w:tab w:val="left" w:pos="0"/>
         </w:tabs>
-        <w:ind w:left="3828" w:firstLine="141"/>
+        <w:ind w:left="2835"/>
         <w:jc w:val="both"/>
       </w:pPr>
       <w:r>
@@ -2084,7 +2084,7 @@
         <w:tabs>
           <w:tab w:val="left" w:pos="0"/>
         </w:tabs>
-        <w:ind w:left="3828" w:firstLine="141"/>
+        <w:ind w:left="2835" w:firstLine="141"/>
         <w:jc w:val="both"/>
       </w:pPr>
       <w:r>
@@ -2899,43 +2899,13 @@
       </w:tr>
     </w:tbl>
     <w:p>
-      <w:proofErr w:type="spellStart"/>
-      <w:r>
+      <w:pPr>
         <w:rPr>
           <w:bCs/>
         </w:rPr>
-        <w:t>Poz</w:t>
-      </w:r>
-      <w:r>
-        <w:rPr>
-          <w:bCs/>
-        </w:rPr>
-        <w:t>námky</w:t>
-      </w:r>
-      <w:proofErr w:type="spellEnd"/>
-      <w:r>
-        <w:rPr>
-          <w:bCs/>
-        </w:rPr>
-        <w:t xml:space="preserve"> k </w:t>
-      </w:r>
-      <w:proofErr w:type="spellStart"/>
-      <w:r>
-        <w:rPr>
-          <w:bCs/>
-        </w:rPr>
-        <w:t>rozvaděči</w:t>
-      </w:r>
-      <w:proofErr w:type="spellEnd"/>
-      <w:r>
-        <w:rPr>
-          <w:bCs/>
-        </w:rPr>
-        <w:t>:</w:t>
-      </w:r>
-      <w:r>
-        <w:t xml:space="preserve"> </w:t>
-      </w:r>
+      </w:pPr>
+    </w:p>
+    <w:p>
       <w:r>
         <w:t>{{</w:t>
       </w:r>
@@ -3295,7 +3265,6 @@
           <w:b/>
           <w:sz w:val="23"/>
         </w:rPr>
-        <w:lastRenderedPageBreak/>
         <w:t>Prostory</w:t>
       </w:r>
       <w:proofErr w:type="spellEnd"/>
@@ -3774,10 +3743,19 @@
             </w:pPr>
             <w:r>
               <w:rPr>
+                <w:b/>
+                <w:bCs/>
                 <w:sz w:val="24"/>
                 <w:szCs w:val="24"/>
               </w:rPr>
-              <w:t xml:space="preserve">{{poradi}}. </w:t>
+              <w:t>{{poradi}}.</w:t>
+            </w:r>
+            <w:r>
+              <w:rPr>
+                <w:sz w:val="24"/>
+                <w:szCs w:val="24"/>
+              </w:rPr>
+              <w:t xml:space="preserve"> </w:t>
             </w:r>
             <w:r>
               <w:rPr>

</xml_diff>

<commit_message>
Adjust non-compliant electrical conclusion exports
</commit_message>
<xml_diff>
--- a/revize-frontend/dist/templates/elektro_rz_template_compact_conditional_images_boxed.docx
+++ b/revize-frontend/dist/templates/elektro_rz_template_compact_conditional_images_boxed.docx
@@ -1265,27 +1265,17 @@
           <w:sz w:val="28"/>
           <w:szCs w:val="32"/>
         </w:rPr>
-        <w:t>{{</w:t>
-      </w:r>
-      <w:proofErr w:type="spellStart"/>
+        <w:t>{{#zaver_bezpecnost_normalni_rows}}{{text}}{{/zaver_bezpecnost_normalni_rows}}</w:t>
+      </w:r>
       <w:r>
         <w:rPr>
           <w:b/>
           <w:bCs/>
+          <w:color w:val="C00000"/>
           <w:sz w:val="28"/>
           <w:szCs w:val="32"/>
         </w:rPr>
-        <w:t>zaver_bezpecnost</w:t>
-      </w:r>
-      <w:proofErr w:type="spellEnd"/>
-      <w:r>
-        <w:rPr>
-          <w:b/>
-          <w:bCs/>
-          <w:sz w:val="28"/>
-          <w:szCs w:val="32"/>
-        </w:rPr>
-        <w:t>}}</w:t>
+        <w:t>{{#zaver_bezpecnost_cervena_rows}}{{text}}{{/zaver_bezpecnost_cervena_rows}}</w:t>
       </w:r>
     </w:p>
     <w:p>
@@ -3969,27 +3959,17 @@
           <w:sz w:val="24"/>
           <w:szCs w:val="28"/>
         </w:rPr>
-        <w:t>{{</w:t>
-      </w:r>
-      <w:proofErr w:type="spellStart"/>
+        <w:t>{{#zaver_bezpecnost_normalni_rows}}{{text}}{{/zaver_bezpecnost_normalni_rows}}</w:t>
+      </w:r>
       <w:r>
         <w:rPr>
           <w:b/>
           <w:bCs/>
+          <w:color w:val="C00000"/>
           <w:sz w:val="24"/>
           <w:szCs w:val="28"/>
         </w:rPr>
-        <w:t>zaver_bezpecnost</w:t>
-      </w:r>
-      <w:proofErr w:type="spellEnd"/>
-      <w:r>
-        <w:rPr>
-          <w:b/>
-          <w:bCs/>
-          <w:sz w:val="24"/>
-          <w:szCs w:val="28"/>
-        </w:rPr>
-        <w:t>}}</w:t>
+        <w:t>{{#zaver_bezpecnost_cervena_rows}}{{text}}{{/zaver_bezpecnost_cervena_rows}}</w:t>
       </w:r>
     </w:p>
     <w:p>

</xml_diff>